<commit_message>
Update salivary gland staging section to AJCC Version 9
Co-Authored-By: Claude Opus 5.5 <noreply@anthropic.com>
Claude-Session: https://claude.ai/code/session_018kUZ6ZXtswLJr6ywNJsDTe
</commit_message>
<xml_diff>
--- a/docs/Salivary_Gland_Tumors_WHO5_Imaging.docx
+++ b/docs/Salivary_Gland_Tumors_WHO5_Imaging.docx
@@ -8254,7 +8254,109 @@
         <w:rPr>
           <w:rFonts w:ascii="Malgun Gothic" w:cs="Malgun Gothic" w:eastAsia="Malgun Gothic" w:hAnsi="Malgun Gothic"/>
         </w:rPr>
-        <w:t xml:space="preserve">7. 병기 (AJCC 8th, Major salivary glands) — T category</w:t>
+        <w:t xml:space="preserve">7. 병기 — AJCC Version 9 / UICC TNM9 (Salivary gland carcinoma)</w:t>
+      </w:r>
+    </w:p>
+    <w:p>
+      <w:pPr>
+        <w:pStyle w:val="ListParagraph"/>
+        <w:numPr>
+          <w:ilvl w:val="0"/>
+          <w:numId w:val="2"/>
+        </w:numPr>
+        <w:spacing w:after="40"/>
+      </w:pPr>
+      <w:r>
+        <w:rPr>
+          <w:rFonts w:ascii="Malgun Gothic" w:cs="Malgun Gothic" w:eastAsia="Malgun Gothic" w:hAnsi="Malgun Gothic"/>
+        </w:rPr>
+        <w:t xml:space="preserve">AJCC V9 salivary gland protocol </w:t>
+      </w:r>
+      <w:r>
+        <w:rPr>
+          <w:rFonts w:ascii="Malgun Gothic" w:cs="Malgun Gothic" w:eastAsia="Malgun Gothic" w:hAnsi="Malgun Gothic"/>
+          <w:b/>
+          <w:bCs/>
+        </w:rPr>
+        <w:t xml:space="preserve">2026-01-01 시행</w:t>
+      </w:r>
+      <w:r>
+        <w:rPr>
+          <w:rFonts w:ascii="Malgun Gothic" w:cs="Malgun Gothic" w:eastAsia="Malgun Gothic" w:hAnsi="Malgun Gothic"/>
+        </w:rPr>
+        <w:t xml:space="preserve"> (8th ed. 대체), UICC 9th ed. 2025-07 출판 [18]</w:t>
+      </w:r>
+    </w:p>
+    <w:p>
+      <w:pPr>
+        <w:pStyle w:val="ListParagraph"/>
+        <w:numPr>
+          <w:ilvl w:val="0"/>
+          <w:numId w:val="2"/>
+        </w:numPr>
+        <w:spacing w:after="40"/>
+      </w:pPr>
+      <w:r>
+        <w:rPr>
+          <w:rFonts w:ascii="Malgun Gothic" w:cs="Malgun Gothic" w:eastAsia="Malgun Gothic" w:hAnsi="Malgun Gothic"/>
+          <w:b/>
+          <w:bCs/>
+        </w:rPr>
+        <w:t xml:space="preserve">Major + minor salivary gland carcinoma 통합</w:t>
+      </w:r>
+      <w:r>
+        <w:rPr>
+          <w:rFonts w:ascii="Malgun Gothic" w:cs="Malgun Gothic" w:eastAsia="Malgun Gothic" w:hAnsi="Malgun Gothic"/>
+        </w:rPr>
+        <w:t xml:space="preserve"> (minor도 더 이상 발생 부위별 병기 사용 안 함) [18]</w:t>
+      </w:r>
+    </w:p>
+    <w:p>
+      <w:pPr>
+        <w:pStyle w:val="ListParagraph"/>
+        <w:numPr>
+          <w:ilvl w:val="0"/>
+          <w:numId w:val="2"/>
+        </w:numPr>
+        <w:spacing w:after="40"/>
+      </w:pPr>
+      <w:r>
+        <w:rPr>
+          <w:rFonts w:ascii="Malgun Gothic" w:cs="Malgun Gothic" w:eastAsia="Malgun Gothic" w:hAnsi="Malgun Gothic"/>
+          <w:b/>
+          <w:bCs/>
+        </w:rPr>
+        <w:t xml:space="preserve">제외 조직형</w:t>
+      </w:r>
+      <w:r>
+        <w:rPr>
+          <w:rFonts w:ascii="Malgun Gothic" w:cs="Malgun Gothic" w:eastAsia="Malgun Gothic" w:hAnsi="Malgun Gothic"/>
+        </w:rPr>
+        <w:t xml:space="preserve">: squamous cell carcinoma, neuroendocrine carcinoma, basosquamous carcinoma [18]</w:t>
+      </w:r>
+    </w:p>
+    <w:p>
+      <w:pPr>
+        <w:pStyle w:val="ListParagraph"/>
+        <w:numPr>
+          <w:ilvl w:val="0"/>
+          <w:numId w:val="2"/>
+        </w:numPr>
+        <w:spacing w:after="40"/>
+      </w:pPr>
+      <w:r>
+        <w:rPr>
+          <w:rFonts w:ascii="Malgun Gothic" w:cs="Malgun Gothic" w:eastAsia="Malgun Gothic" w:hAnsi="Malgun Gothic"/>
+          <w:b/>
+          <w:bCs/>
+        </w:rPr>
+        <w:t xml:space="preserve">cTNM = pTNM 기준 동일</w:t>
+      </w:r>
+      <w:r>
+        <w:rPr>
+          <w:rFonts w:ascii="Malgun Gothic" w:cs="Malgun Gothic" w:eastAsia="Malgun Gothic" w:hAnsi="Malgun Gothic"/>
+        </w:rPr>
+        <w:t xml:space="preserve">, 단 임상/영상 근거 사용 → 영상 판독문에 이상 LN 개수(parotid + cervical 합산), iENE 유무 기재 권고 [18]</w:t>
       </w:r>
     </w:p>
     <w:tbl>
@@ -8271,7 +8373,8 @@
       </w:tblPr>
       <w:tblGrid>
         <w:gridCol w:w="964"/>
-        <w:gridCol w:w="8674"/>
+        <w:gridCol w:w="1157"/>
+        <w:gridCol w:w="7517"/>
       </w:tblGrid>
       <w:tr>
         <w:trPr>
@@ -8304,13 +8407,13 @@
                 <w:sz w:val="17"/>
                 <w:szCs w:val="17"/>
               </w:rPr>
-              <w:t xml:space="preserve">T</w:t>
-            </w:r>
-          </w:p>
-        </w:tc>
-        <w:tc>
-          <w:tcPr>
-            <w:tcW w:type="dxa" w:w="8674"/>
+              <w:t xml:space="preserve">구분</w:t>
+            </w:r>
+          </w:p>
+        </w:tc>
+        <w:tc>
+          <w:tcPr>
+            <w:tcW w:type="dxa" w:w="1157"/>
             <w:tcBorders>
               <w:top w:val="single" w:color="A0A0A0" w:sz="4"/>
               <w:left w:val="single" w:color="A0A0A0" w:sz="4"/>
@@ -8335,7 +8438,38 @@
                 <w:sz w:val="17"/>
                 <w:szCs w:val="17"/>
               </w:rPr>
-              <w:t xml:space="preserve">정의</w:t>
+              <w:t xml:space="preserve">Category</w:t>
+            </w:r>
+          </w:p>
+        </w:tc>
+        <w:tc>
+          <w:tcPr>
+            <w:tcW w:type="dxa" w:w="7517"/>
+            <w:tcBorders>
+              <w:top w:val="single" w:color="A0A0A0" w:sz="4"/>
+              <w:left w:val="single" w:color="A0A0A0" w:sz="4"/>
+              <w:bottom w:val="single" w:color="A0A0A0" w:sz="4"/>
+              <w:right w:val="single" w:color="A0A0A0" w:sz="4"/>
+            </w:tcBorders>
+            <w:shd w:fill="1F4E79" w:color="auto" w:val="clear"/>
+            <w:tcMar>
+              <w:top w:type="dxa" w:w="60"/>
+              <w:left w:type="dxa" w:w="90"/>
+              <w:bottom w:type="dxa" w:w="60"/>
+              <w:right w:type="dxa" w:w="90"/>
+            </w:tcMar>
+          </w:tcPr>
+          <w:p>
+            <w:r>
+              <w:rPr>
+                <w:rFonts w:ascii="Malgun Gothic" w:cs="Malgun Gothic" w:eastAsia="Malgun Gothic" w:hAnsi="Malgun Gothic"/>
+                <w:b/>
+                <w:bCs/>
+                <w:color w:val="FFFFFF"/>
+                <w:sz w:val="17"/>
+                <w:szCs w:val="17"/>
+              </w:rPr>
+              <w:t xml:space="preserve">정의 (AJCC V9)</w:t>
             </w:r>
           </w:p>
         </w:tc>
@@ -8364,34 +8498,61 @@
                 <w:sz w:val="17"/>
                 <w:szCs w:val="17"/>
               </w:rPr>
+              <w:t xml:space="preserve">T</w:t>
+            </w:r>
+          </w:p>
+        </w:tc>
+        <w:tc>
+          <w:tcPr>
+            <w:tcW w:type="dxa" w:w="1157"/>
+            <w:tcBorders>
+              <w:top w:val="single" w:color="A0A0A0" w:sz="4"/>
+              <w:left w:val="single" w:color="A0A0A0" w:sz="4"/>
+              <w:bottom w:val="single" w:color="A0A0A0" w:sz="4"/>
+              <w:right w:val="single" w:color="A0A0A0" w:sz="4"/>
+            </w:tcBorders>
+            <w:tcMar>
+              <w:top w:type="dxa" w:w="60"/>
+              <w:left w:type="dxa" w:w="90"/>
+              <w:bottom w:type="dxa" w:w="60"/>
+              <w:right w:type="dxa" w:w="90"/>
+            </w:tcMar>
+          </w:tcPr>
+          <w:p>
+            <w:r>
+              <w:rPr>
+                <w:rFonts w:ascii="Malgun Gothic" w:cs="Malgun Gothic" w:eastAsia="Malgun Gothic" w:hAnsi="Malgun Gothic"/>
+                <w:sz w:val="17"/>
+                <w:szCs w:val="17"/>
+              </w:rPr>
               <w:t xml:space="preserve">T1</w:t>
             </w:r>
           </w:p>
         </w:tc>
         <w:tc>
           <w:tcPr>
-            <w:tcW w:type="dxa" w:w="8674"/>
-            <w:tcBorders>
-              <w:top w:val="single" w:color="A0A0A0" w:sz="4"/>
-              <w:left w:val="single" w:color="A0A0A0" w:sz="4"/>
-              <w:bottom w:val="single" w:color="A0A0A0" w:sz="4"/>
-              <w:right w:val="single" w:color="A0A0A0" w:sz="4"/>
-            </w:tcBorders>
-            <w:tcMar>
-              <w:top w:type="dxa" w:w="60"/>
-              <w:left w:type="dxa" w:w="90"/>
-              <w:bottom w:type="dxa" w:w="60"/>
-              <w:right w:type="dxa" w:w="90"/>
-            </w:tcMar>
-          </w:tcPr>
-          <w:p>
-            <w:r>
-              <w:rPr>
-                <w:rFonts w:ascii="Malgun Gothic" w:cs="Malgun Gothic" w:eastAsia="Malgun Gothic" w:hAnsi="Malgun Gothic"/>
-                <w:sz w:val="17"/>
-                <w:szCs w:val="17"/>
-              </w:rPr>
-              <w:t xml:space="preserve">≤ 2 cm, extraparenchymal extension(EPE) 없음</w:t>
+            <w:tcW w:type="dxa" w:w="7517"/>
+            <w:tcBorders>
+              <w:top w:val="single" w:color="A0A0A0" w:sz="4"/>
+              <w:left w:val="single" w:color="A0A0A0" w:sz="4"/>
+              <w:bottom w:val="single" w:color="A0A0A0" w:sz="4"/>
+              <w:right w:val="single" w:color="A0A0A0" w:sz="4"/>
+            </w:tcBorders>
+            <w:tcMar>
+              <w:top w:type="dxa" w:w="60"/>
+              <w:left w:type="dxa" w:w="90"/>
+              <w:bottom w:type="dxa" w:w="60"/>
+              <w:right w:type="dxa" w:w="90"/>
+            </w:tcMar>
+          </w:tcPr>
+          <w:p>
+            <w:r>
+              <w:rPr>
+                <w:rFonts w:ascii="Malgun Gothic" w:cs="Malgun Gothic" w:eastAsia="Malgun Gothic" w:hAnsi="Malgun Gothic"/>
+                <w:sz w:val="17"/>
+                <w:szCs w:val="17"/>
+              </w:rPr>
+              <w:t xml:space="preserve">≤ 2 cm, gross extraparenchymal extension(EPE) 없음</w:t>
             </w:r>
           </w:p>
         </w:tc>
@@ -8414,6 +8575,25 @@
               <w:right w:type="dxa" w:w="90"/>
             </w:tcMar>
           </w:tcPr>
+          <w:p/>
+        </w:tc>
+        <w:tc>
+          <w:tcPr>
+            <w:tcW w:type="dxa" w:w="1157"/>
+            <w:tcBorders>
+              <w:top w:val="single" w:color="A0A0A0" w:sz="4"/>
+              <w:left w:val="single" w:color="A0A0A0" w:sz="4"/>
+              <w:bottom w:val="single" w:color="A0A0A0" w:sz="4"/>
+              <w:right w:val="single" w:color="A0A0A0" w:sz="4"/>
+            </w:tcBorders>
+            <w:shd w:fill="F2F6FA" w:color="auto" w:val="clear"/>
+            <w:tcMar>
+              <w:top w:type="dxa" w:w="60"/>
+              <w:left w:type="dxa" w:w="90"/>
+              <w:bottom w:type="dxa" w:w="60"/>
+              <w:right w:type="dxa" w:w="90"/>
+            </w:tcMar>
+          </w:tcPr>
           <w:p>
             <w:r>
               <w:rPr>
@@ -8427,7 +8607,7 @@
         </w:tc>
         <w:tc>
           <w:tcPr>
-            <w:tcW w:type="dxa" w:w="8674"/>
+            <w:tcW w:type="dxa" w:w="7517"/>
             <w:tcBorders>
               <w:top w:val="single" w:color="A0A0A0" w:sz="4"/>
               <w:left w:val="single" w:color="A0A0A0" w:sz="4"/>
@@ -8449,7 +8629,7 @@
                 <w:sz w:val="17"/>
                 <w:szCs w:val="17"/>
               </w:rPr>
-              <w:t xml:space="preserve">&gt; 2 cm 이고 ≤ 4 cm, EPE 없음</w:t>
+              <w:t xml:space="preserve">&gt; 2 cm 이고 ≤ 4 cm, gross EPE 없음</w:t>
             </w:r>
           </w:p>
         </w:tc>
@@ -8471,6 +8651,24 @@
               <w:right w:type="dxa" w:w="90"/>
             </w:tcMar>
           </w:tcPr>
+          <w:p/>
+        </w:tc>
+        <w:tc>
+          <w:tcPr>
+            <w:tcW w:type="dxa" w:w="1157"/>
+            <w:tcBorders>
+              <w:top w:val="single" w:color="A0A0A0" w:sz="4"/>
+              <w:left w:val="single" w:color="A0A0A0" w:sz="4"/>
+              <w:bottom w:val="single" w:color="A0A0A0" w:sz="4"/>
+              <w:right w:val="single" w:color="A0A0A0" w:sz="4"/>
+            </w:tcBorders>
+            <w:tcMar>
+              <w:top w:type="dxa" w:w="60"/>
+              <w:left w:type="dxa" w:w="90"/>
+              <w:bottom w:type="dxa" w:w="60"/>
+              <w:right w:type="dxa" w:w="90"/>
+            </w:tcMar>
+          </w:tcPr>
           <w:p>
             <w:r>
               <w:rPr>
@@ -8484,28 +8682,44 @@
         </w:tc>
         <w:tc>
           <w:tcPr>
-            <w:tcW w:type="dxa" w:w="8674"/>
-            <w:tcBorders>
-              <w:top w:val="single" w:color="A0A0A0" w:sz="4"/>
-              <w:left w:val="single" w:color="A0A0A0" w:sz="4"/>
-              <w:bottom w:val="single" w:color="A0A0A0" w:sz="4"/>
-              <w:right w:val="single" w:color="A0A0A0" w:sz="4"/>
-            </w:tcBorders>
-            <w:tcMar>
-              <w:top w:type="dxa" w:w="60"/>
-              <w:left w:type="dxa" w:w="90"/>
-              <w:bottom w:type="dxa" w:w="60"/>
-              <w:right w:type="dxa" w:w="90"/>
-            </w:tcMar>
-          </w:tcPr>
-          <w:p>
-            <w:r>
-              <w:rPr>
-                <w:rFonts w:ascii="Malgun Gothic" w:cs="Malgun Gothic" w:eastAsia="Malgun Gothic" w:hAnsi="Malgun Gothic"/>
-                <w:sz w:val="17"/>
-                <w:szCs w:val="17"/>
-              </w:rPr>
-              <w:t xml:space="preserve">&gt; 4 cm 및/또는 EPE</w:t>
+            <w:tcW w:type="dxa" w:w="7517"/>
+            <w:tcBorders>
+              <w:top w:val="single" w:color="A0A0A0" w:sz="4"/>
+              <w:left w:val="single" w:color="A0A0A0" w:sz="4"/>
+              <w:bottom w:val="single" w:color="A0A0A0" w:sz="4"/>
+              <w:right w:val="single" w:color="A0A0A0" w:sz="4"/>
+            </w:tcBorders>
+            <w:tcMar>
+              <w:top w:type="dxa" w:w="60"/>
+              <w:left w:type="dxa" w:w="90"/>
+              <w:bottom w:type="dxa" w:w="60"/>
+              <w:right w:type="dxa" w:w="90"/>
+            </w:tcMar>
+          </w:tcPr>
+          <w:p>
+            <w:r>
+              <w:rPr>
+                <w:rFonts w:ascii="Malgun Gothic" w:cs="Malgun Gothic" w:eastAsia="Malgun Gothic" w:hAnsi="Malgun Gothic"/>
+                <w:sz w:val="17"/>
+                <w:szCs w:val="17"/>
+              </w:rPr>
+              <w:t xml:space="preserve">&gt; 4 cm 및/또는 </w:t>
+            </w:r>
+            <w:r>
+              <w:rPr>
+                <w:rFonts w:ascii="Malgun Gothic" w:cs="Malgun Gothic" w:eastAsia="Malgun Gothic" w:hAnsi="Malgun Gothic"/>
+                <w:sz w:val="17"/>
+                <w:szCs w:val="17"/>
+              </w:rPr>
+              <w:t xml:space="preserve">gross EPE</w:t>
+            </w:r>
+            <w:r>
+              <w:rPr>
+                <w:rFonts w:ascii="Malgun Gothic" w:cs="Malgun Gothic" w:eastAsia="Malgun Gothic" w:hAnsi="Malgun Gothic"/>
+                <w:sz w:val="17"/>
+                <w:szCs w:val="17"/>
+              </w:rPr>
+              <w:t xml:space="preserve"> (연부조직 또는 이름 없는 신경 침범; 현미경적 침범만으로는 해당 안 됨)</w:t>
             </w:r>
           </w:p>
         </w:tc>
@@ -8528,6 +8742,25 @@
               <w:right w:type="dxa" w:w="90"/>
             </w:tcMar>
           </w:tcPr>
+          <w:p/>
+        </w:tc>
+        <w:tc>
+          <w:tcPr>
+            <w:tcW w:type="dxa" w:w="1157"/>
+            <w:tcBorders>
+              <w:top w:val="single" w:color="A0A0A0" w:sz="4"/>
+              <w:left w:val="single" w:color="A0A0A0" w:sz="4"/>
+              <w:bottom w:val="single" w:color="A0A0A0" w:sz="4"/>
+              <w:right w:val="single" w:color="A0A0A0" w:sz="4"/>
+            </w:tcBorders>
+            <w:shd w:fill="F2F6FA" w:color="auto" w:val="clear"/>
+            <w:tcMar>
+              <w:top w:type="dxa" w:w="60"/>
+              <w:left w:type="dxa" w:w="90"/>
+              <w:bottom w:type="dxa" w:w="60"/>
+              <w:right w:type="dxa" w:w="90"/>
+            </w:tcMar>
+          </w:tcPr>
           <w:p>
             <w:r>
               <w:rPr>
@@ -8541,7 +8774,7 @@
         </w:tc>
         <w:tc>
           <w:tcPr>
-            <w:tcW w:type="dxa" w:w="8674"/>
+            <w:tcW w:type="dxa" w:w="7517"/>
             <w:tcBorders>
               <w:top w:val="single" w:color="A0A0A0" w:sz="4"/>
               <w:left w:val="single" w:color="A0A0A0" w:sz="4"/>
@@ -8563,23 +8796,43 @@
                 <w:sz w:val="17"/>
                 <w:szCs w:val="17"/>
               </w:rPr>
-              <w:t xml:space="preserve">피부, 하악골, 외이도, </w:t>
-            </w:r>
-            <w:r>
-              <w:rPr>
-                <w:rFonts w:ascii="Malgun Gothic" w:cs="Malgun Gothic" w:eastAsia="Malgun Gothic" w:hAnsi="Malgun Gothic"/>
-                <w:sz w:val="17"/>
-                <w:szCs w:val="17"/>
-              </w:rPr>
-              <w:t xml:space="preserve">facial nerve</w:t>
-            </w:r>
-            <w:r>
-              <w:rPr>
-                <w:rFonts w:ascii="Malgun Gothic" w:cs="Malgun Gothic" w:eastAsia="Malgun Gothic" w:hAnsi="Malgun Gothic"/>
-                <w:sz w:val="17"/>
-                <w:szCs w:val="17"/>
-              </w:rPr>
-              <w:t xml:space="preserve"> 침범</w:t>
+              <w:t xml:space="preserve">인접 구조 침범</w:t>
+            </w:r>
+            <w:r>
+              <w:rPr>
+                <w:rFonts w:ascii="Malgun Gothic" w:cs="Malgun Gothic" w:eastAsia="Malgun Gothic" w:hAnsi="Malgun Gothic"/>
+                <w:sz w:val="17"/>
+                <w:szCs w:val="17"/>
+              </w:rPr>
+              <w:t xml:space="preserve"> (named nerve 포함) 또는 </w:t>
+            </w:r>
+            <w:r>
+              <w:rPr>
+                <w:rFonts w:ascii="Malgun Gothic" w:cs="Malgun Gothic" w:eastAsia="Malgun Gothic" w:hAnsi="Malgun Gothic"/>
+                <w:sz w:val="17"/>
+                <w:szCs w:val="17"/>
+              </w:rPr>
+              <w:t xml:space="preserve">bone invasion</w:t>
+            </w:r>
+          </w:p>
+          <w:p>
+            <w:r>
+              <w:rPr>
+                <w:rFonts w:ascii="Malgun Gothic" w:cs="Malgun Gothic" w:eastAsia="Malgun Gothic" w:hAnsi="Malgun Gothic"/>
+                <w:sz w:val="17"/>
+                <w:szCs w:val="17"/>
+              </w:rPr>
+              <w:t xml:space="preserve">(8판 예시: 피부, 하악골, 외이도, facial nerve)</w:t>
+            </w:r>
+          </w:p>
+          <w:p>
+            <w:r>
+              <w:rPr>
+                <w:rFonts w:ascii="Malgun Gothic" w:cs="Malgun Gothic" w:eastAsia="Malgun Gothic" w:hAnsi="Malgun Gothic"/>
+                <w:sz w:val="17"/>
+                <w:szCs w:val="17"/>
+              </w:rPr>
+              <w:t xml:space="preserve">※ cortical erosion 단독, 부비동 고유 골 파괴(sinonasal primary), 원발성 intraosseous SGC는 T4a 아님</w:t>
             </w:r>
           </w:p>
         </w:tc>
@@ -8601,6 +8854,24 @@
               <w:right w:type="dxa" w:w="90"/>
             </w:tcMar>
           </w:tcPr>
+          <w:p/>
+        </w:tc>
+        <w:tc>
+          <w:tcPr>
+            <w:tcW w:type="dxa" w:w="1157"/>
+            <w:tcBorders>
+              <w:top w:val="single" w:color="A0A0A0" w:sz="4"/>
+              <w:left w:val="single" w:color="A0A0A0" w:sz="4"/>
+              <w:bottom w:val="single" w:color="A0A0A0" w:sz="4"/>
+              <w:right w:val="single" w:color="A0A0A0" w:sz="4"/>
+            </w:tcBorders>
+            <w:tcMar>
+              <w:top w:type="dxa" w:w="60"/>
+              <w:left w:type="dxa" w:w="90"/>
+              <w:bottom w:type="dxa" w:w="60"/>
+              <w:right w:type="dxa" w:w="90"/>
+            </w:tcMar>
+          </w:tcPr>
           <w:p>
             <w:r>
               <w:rPr>
@@ -8614,28 +8885,878 @@
         </w:tc>
         <w:tc>
           <w:tcPr>
-            <w:tcW w:type="dxa" w:w="8674"/>
-            <w:tcBorders>
-              <w:top w:val="single" w:color="A0A0A0" w:sz="4"/>
-              <w:left w:val="single" w:color="A0A0A0" w:sz="4"/>
-              <w:bottom w:val="single" w:color="A0A0A0" w:sz="4"/>
-              <w:right w:val="single" w:color="A0A0A0" w:sz="4"/>
-            </w:tcBorders>
-            <w:tcMar>
-              <w:top w:type="dxa" w:w="60"/>
-              <w:left w:type="dxa" w:w="90"/>
-              <w:bottom w:type="dxa" w:w="60"/>
-              <w:right w:type="dxa" w:w="90"/>
-            </w:tcMar>
-          </w:tcPr>
-          <w:p>
-            <w:r>
-              <w:rPr>
-                <w:rFonts w:ascii="Malgun Gothic" w:cs="Malgun Gothic" w:eastAsia="Malgun Gothic" w:hAnsi="Malgun Gothic"/>
-                <w:sz w:val="17"/>
-                <w:szCs w:val="17"/>
-              </w:rPr>
-              <w:t xml:space="preserve">Skull base, pterygoid plates 침범 또는 carotid artery encasement</w:t>
+            <w:tcW w:type="dxa" w:w="7517"/>
+            <w:tcBorders>
+              <w:top w:val="single" w:color="A0A0A0" w:sz="4"/>
+              <w:left w:val="single" w:color="A0A0A0" w:sz="4"/>
+              <w:bottom w:val="single" w:color="A0A0A0" w:sz="4"/>
+              <w:right w:val="single" w:color="A0A0A0" w:sz="4"/>
+            </w:tcBorders>
+            <w:tcMar>
+              <w:top w:type="dxa" w:w="60"/>
+              <w:left w:type="dxa" w:w="90"/>
+              <w:bottom w:type="dxa" w:w="60"/>
+              <w:right w:type="dxa" w:w="90"/>
+            </w:tcMar>
+          </w:tcPr>
+          <w:p>
+            <w:r>
+              <w:rPr>
+                <w:rFonts w:ascii="Malgun Gothic" w:cs="Malgun Gothic" w:eastAsia="Malgun Gothic" w:hAnsi="Malgun Gothic"/>
+                <w:sz w:val="17"/>
+                <w:szCs w:val="17"/>
+              </w:rPr>
+              <w:t xml:space="preserve">인접 구조 너머 침범</w:t>
+            </w:r>
+          </w:p>
+          <w:p>
+            <w:r>
+              <w:rPr>
+                <w:rFonts w:ascii="Malgun Gothic" w:cs="Malgun Gothic" w:eastAsia="Malgun Gothic" w:hAnsi="Malgun Gothic"/>
+                <w:sz w:val="17"/>
+                <w:szCs w:val="17"/>
+              </w:rPr>
+              <w:t xml:space="preserve">(8판 예시: skull base, pterygoid plates, carotid artery encasement)</w:t>
+            </w:r>
+          </w:p>
+        </w:tc>
+      </w:tr>
+      <w:tr>
+        <w:tc>
+          <w:tcPr>
+            <w:tcW w:type="dxa" w:w="964"/>
+            <w:tcBorders>
+              <w:top w:val="single" w:color="A0A0A0" w:sz="4"/>
+              <w:left w:val="single" w:color="A0A0A0" w:sz="4"/>
+              <w:bottom w:val="single" w:color="A0A0A0" w:sz="4"/>
+              <w:right w:val="single" w:color="A0A0A0" w:sz="4"/>
+            </w:tcBorders>
+            <w:shd w:fill="F2F6FA" w:color="auto" w:val="clear"/>
+            <w:tcMar>
+              <w:top w:type="dxa" w:w="60"/>
+              <w:left w:type="dxa" w:w="90"/>
+              <w:bottom w:type="dxa" w:w="60"/>
+              <w:right w:type="dxa" w:w="90"/>
+            </w:tcMar>
+          </w:tcPr>
+          <w:p>
+            <w:r>
+              <w:rPr>
+                <w:rFonts w:ascii="Malgun Gothic" w:cs="Malgun Gothic" w:eastAsia="Malgun Gothic" w:hAnsi="Malgun Gothic"/>
+                <w:sz w:val="17"/>
+                <w:szCs w:val="17"/>
+              </w:rPr>
+              <w:t xml:space="preserve">N</w:t>
+            </w:r>
+          </w:p>
+        </w:tc>
+        <w:tc>
+          <w:tcPr>
+            <w:tcW w:type="dxa" w:w="1157"/>
+            <w:tcBorders>
+              <w:top w:val="single" w:color="A0A0A0" w:sz="4"/>
+              <w:left w:val="single" w:color="A0A0A0" w:sz="4"/>
+              <w:bottom w:val="single" w:color="A0A0A0" w:sz="4"/>
+              <w:right w:val="single" w:color="A0A0A0" w:sz="4"/>
+            </w:tcBorders>
+            <w:shd w:fill="F2F6FA" w:color="auto" w:val="clear"/>
+            <w:tcMar>
+              <w:top w:type="dxa" w:w="60"/>
+              <w:left w:type="dxa" w:w="90"/>
+              <w:bottom w:type="dxa" w:w="60"/>
+              <w:right w:type="dxa" w:w="90"/>
+            </w:tcMar>
+          </w:tcPr>
+          <w:p>
+            <w:r>
+              <w:rPr>
+                <w:rFonts w:ascii="Malgun Gothic" w:cs="Malgun Gothic" w:eastAsia="Malgun Gothic" w:hAnsi="Malgun Gothic"/>
+                <w:sz w:val="17"/>
+                <w:szCs w:val="17"/>
+              </w:rPr>
+              <w:t xml:space="preserve">N0</w:t>
+            </w:r>
+          </w:p>
+        </w:tc>
+        <w:tc>
+          <w:tcPr>
+            <w:tcW w:type="dxa" w:w="7517"/>
+            <w:tcBorders>
+              <w:top w:val="single" w:color="A0A0A0" w:sz="4"/>
+              <w:left w:val="single" w:color="A0A0A0" w:sz="4"/>
+              <w:bottom w:val="single" w:color="A0A0A0" w:sz="4"/>
+              <w:right w:val="single" w:color="A0A0A0" w:sz="4"/>
+            </w:tcBorders>
+            <w:shd w:fill="F2F6FA" w:color="auto" w:val="clear"/>
+            <w:tcMar>
+              <w:top w:type="dxa" w:w="60"/>
+              <w:left w:type="dxa" w:w="90"/>
+              <w:bottom w:type="dxa" w:w="60"/>
+              <w:right w:type="dxa" w:w="90"/>
+            </w:tcMar>
+          </w:tcPr>
+          <w:p>
+            <w:r>
+              <w:rPr>
+                <w:rFonts w:ascii="Malgun Gothic" w:cs="Malgun Gothic" w:eastAsia="Malgun Gothic" w:hAnsi="Malgun Gothic"/>
+                <w:sz w:val="17"/>
+                <w:szCs w:val="17"/>
+              </w:rPr>
+              <w:t xml:space="preserve">림프절 전이 없음</w:t>
+            </w:r>
+          </w:p>
+        </w:tc>
+      </w:tr>
+      <w:tr>
+        <w:tc>
+          <w:tcPr>
+            <w:tcW w:type="dxa" w:w="964"/>
+            <w:tcBorders>
+              <w:top w:val="single" w:color="A0A0A0" w:sz="4"/>
+              <w:left w:val="single" w:color="A0A0A0" w:sz="4"/>
+              <w:bottom w:val="single" w:color="A0A0A0" w:sz="4"/>
+              <w:right w:val="single" w:color="A0A0A0" w:sz="4"/>
+            </w:tcBorders>
+            <w:tcMar>
+              <w:top w:type="dxa" w:w="60"/>
+              <w:left w:type="dxa" w:w="90"/>
+              <w:bottom w:type="dxa" w:w="60"/>
+              <w:right w:type="dxa" w:w="90"/>
+            </w:tcMar>
+          </w:tcPr>
+          <w:p/>
+        </w:tc>
+        <w:tc>
+          <w:tcPr>
+            <w:tcW w:type="dxa" w:w="1157"/>
+            <w:tcBorders>
+              <w:top w:val="single" w:color="A0A0A0" w:sz="4"/>
+              <w:left w:val="single" w:color="A0A0A0" w:sz="4"/>
+              <w:bottom w:val="single" w:color="A0A0A0" w:sz="4"/>
+              <w:right w:val="single" w:color="A0A0A0" w:sz="4"/>
+            </w:tcBorders>
+            <w:tcMar>
+              <w:top w:type="dxa" w:w="60"/>
+              <w:left w:type="dxa" w:w="90"/>
+              <w:bottom w:type="dxa" w:w="60"/>
+              <w:right w:type="dxa" w:w="90"/>
+            </w:tcMar>
+          </w:tcPr>
+          <w:p>
+            <w:r>
+              <w:rPr>
+                <w:rFonts w:ascii="Malgun Gothic" w:cs="Malgun Gothic" w:eastAsia="Malgun Gothic" w:hAnsi="Malgun Gothic"/>
+                <w:sz w:val="17"/>
+                <w:szCs w:val="17"/>
+              </w:rPr>
+              <w:t xml:space="preserve">N1</w:t>
+            </w:r>
+          </w:p>
+        </w:tc>
+        <w:tc>
+          <w:tcPr>
+            <w:tcW w:type="dxa" w:w="7517"/>
+            <w:tcBorders>
+              <w:top w:val="single" w:color="A0A0A0" w:sz="4"/>
+              <w:left w:val="single" w:color="A0A0A0" w:sz="4"/>
+              <w:bottom w:val="single" w:color="A0A0A0" w:sz="4"/>
+              <w:right w:val="single" w:color="A0A0A0" w:sz="4"/>
+            </w:tcBorders>
+            <w:tcMar>
+              <w:top w:type="dxa" w:w="60"/>
+              <w:left w:type="dxa" w:w="90"/>
+              <w:bottom w:type="dxa" w:w="60"/>
+              <w:right w:type="dxa" w:w="90"/>
+            </w:tcMar>
+          </w:tcPr>
+          <w:p>
+            <w:r>
+              <w:rPr>
+                <w:rFonts w:ascii="Malgun Gothic" w:cs="Malgun Gothic" w:eastAsia="Malgun Gothic" w:hAnsi="Malgun Gothic"/>
+                <w:sz w:val="17"/>
+                <w:szCs w:val="17"/>
+              </w:rPr>
+              <w:t xml:space="preserve">1–3개</w:t>
+            </w:r>
+            <w:r>
+              <w:rPr>
+                <w:rFonts w:ascii="Malgun Gothic" w:cs="Malgun Gothic" w:eastAsia="Malgun Gothic" w:hAnsi="Malgun Gothic"/>
+                <w:sz w:val="17"/>
+                <w:szCs w:val="17"/>
+              </w:rPr>
+              <w:t xml:space="preserve"> 전이 LN, ENE 없음</w:t>
+            </w:r>
+          </w:p>
+        </w:tc>
+      </w:tr>
+      <w:tr>
+        <w:tc>
+          <w:tcPr>
+            <w:tcW w:type="dxa" w:w="964"/>
+            <w:tcBorders>
+              <w:top w:val="single" w:color="A0A0A0" w:sz="4"/>
+              <w:left w:val="single" w:color="A0A0A0" w:sz="4"/>
+              <w:bottom w:val="single" w:color="A0A0A0" w:sz="4"/>
+              <w:right w:val="single" w:color="A0A0A0" w:sz="4"/>
+            </w:tcBorders>
+            <w:shd w:fill="F2F6FA" w:color="auto" w:val="clear"/>
+            <w:tcMar>
+              <w:top w:type="dxa" w:w="60"/>
+              <w:left w:type="dxa" w:w="90"/>
+              <w:bottom w:type="dxa" w:w="60"/>
+              <w:right w:type="dxa" w:w="90"/>
+            </w:tcMar>
+          </w:tcPr>
+          <w:p/>
+        </w:tc>
+        <w:tc>
+          <w:tcPr>
+            <w:tcW w:type="dxa" w:w="1157"/>
+            <w:tcBorders>
+              <w:top w:val="single" w:color="A0A0A0" w:sz="4"/>
+              <w:left w:val="single" w:color="A0A0A0" w:sz="4"/>
+              <w:bottom w:val="single" w:color="A0A0A0" w:sz="4"/>
+              <w:right w:val="single" w:color="A0A0A0" w:sz="4"/>
+            </w:tcBorders>
+            <w:shd w:fill="F2F6FA" w:color="auto" w:val="clear"/>
+            <w:tcMar>
+              <w:top w:type="dxa" w:w="60"/>
+              <w:left w:type="dxa" w:w="90"/>
+              <w:bottom w:type="dxa" w:w="60"/>
+              <w:right w:type="dxa" w:w="90"/>
+            </w:tcMar>
+          </w:tcPr>
+          <w:p>
+            <w:r>
+              <w:rPr>
+                <w:rFonts w:ascii="Malgun Gothic" w:cs="Malgun Gothic" w:eastAsia="Malgun Gothic" w:hAnsi="Malgun Gothic"/>
+                <w:sz w:val="17"/>
+                <w:szCs w:val="17"/>
+              </w:rPr>
+              <w:t xml:space="preserve">N2</w:t>
+            </w:r>
+          </w:p>
+        </w:tc>
+        <w:tc>
+          <w:tcPr>
+            <w:tcW w:type="dxa" w:w="7517"/>
+            <w:tcBorders>
+              <w:top w:val="single" w:color="A0A0A0" w:sz="4"/>
+              <w:left w:val="single" w:color="A0A0A0" w:sz="4"/>
+              <w:bottom w:val="single" w:color="A0A0A0" w:sz="4"/>
+              <w:right w:val="single" w:color="A0A0A0" w:sz="4"/>
+            </w:tcBorders>
+            <w:shd w:fill="F2F6FA" w:color="auto" w:val="clear"/>
+            <w:tcMar>
+              <w:top w:type="dxa" w:w="60"/>
+              <w:left w:type="dxa" w:w="90"/>
+              <w:bottom w:type="dxa" w:w="60"/>
+              <w:right w:type="dxa" w:w="90"/>
+            </w:tcMar>
+          </w:tcPr>
+          <w:p>
+            <w:r>
+              <w:rPr>
+                <w:rFonts w:ascii="Malgun Gothic" w:cs="Malgun Gothic" w:eastAsia="Malgun Gothic" w:hAnsi="Malgun Gothic"/>
+                <w:sz w:val="17"/>
+                <w:szCs w:val="17"/>
+              </w:rPr>
+              <w:t xml:space="preserve">&gt; 3개</w:t>
+            </w:r>
+            <w:r>
+              <w:rPr>
+                <w:rFonts w:ascii="Malgun Gothic" w:cs="Malgun Gothic" w:eastAsia="Malgun Gothic" w:hAnsi="Malgun Gothic"/>
+                <w:sz w:val="17"/>
+                <w:szCs w:val="17"/>
+              </w:rPr>
+              <w:t xml:space="preserve">(4개 이상) 전이 LN </w:t>
+            </w:r>
+            <w:r>
+              <w:rPr>
+                <w:rFonts w:ascii="Malgun Gothic" w:cs="Malgun Gothic" w:eastAsia="Malgun Gothic" w:hAnsi="Malgun Gothic"/>
+                <w:sz w:val="17"/>
+                <w:szCs w:val="17"/>
+              </w:rPr>
+              <w:t xml:space="preserve">또는</w:t>
+            </w:r>
+            <w:r>
+              <w:rPr>
+                <w:rFonts w:ascii="Malgun Gothic" w:cs="Malgun Gothic" w:eastAsia="Malgun Gothic" w:hAnsi="Malgun Gothic"/>
+                <w:sz w:val="17"/>
+                <w:szCs w:val="17"/>
+              </w:rPr>
+              <w:t xml:space="preserve"> ENE 동반 LN 1개 이상</w:t>
+            </w:r>
+          </w:p>
+          <w:p>
+            <w:r>
+              <w:rPr>
+                <w:rFonts w:ascii="Malgun Gothic" w:cs="Malgun Gothic" w:eastAsia="Malgun Gothic" w:hAnsi="Malgun Gothic"/>
+                <w:sz w:val="17"/>
+                <w:szCs w:val="17"/>
+              </w:rPr>
+              <w:t xml:space="preserve">※ LN 개수 = parotid + cervical 두경부 전체 합산 / 양측성 별도 구분 없음</w:t>
+            </w:r>
+          </w:p>
+        </w:tc>
+      </w:tr>
+      <w:tr>
+        <w:tc>
+          <w:tcPr>
+            <w:tcW w:type="dxa" w:w="964"/>
+            <w:tcBorders>
+              <w:top w:val="single" w:color="A0A0A0" w:sz="4"/>
+              <w:left w:val="single" w:color="A0A0A0" w:sz="4"/>
+              <w:bottom w:val="single" w:color="A0A0A0" w:sz="4"/>
+              <w:right w:val="single" w:color="A0A0A0" w:sz="4"/>
+            </w:tcBorders>
+            <w:tcMar>
+              <w:top w:type="dxa" w:w="60"/>
+              <w:left w:type="dxa" w:w="90"/>
+              <w:bottom w:type="dxa" w:w="60"/>
+              <w:right w:type="dxa" w:w="90"/>
+            </w:tcMar>
+          </w:tcPr>
+          <w:p>
+            <w:r>
+              <w:rPr>
+                <w:rFonts w:ascii="Malgun Gothic" w:cs="Malgun Gothic" w:eastAsia="Malgun Gothic" w:hAnsi="Malgun Gothic"/>
+                <w:sz w:val="17"/>
+                <w:szCs w:val="17"/>
+              </w:rPr>
+              <w:t xml:space="preserve">M</w:t>
+            </w:r>
+          </w:p>
+        </w:tc>
+        <w:tc>
+          <w:tcPr>
+            <w:tcW w:type="dxa" w:w="1157"/>
+            <w:tcBorders>
+              <w:top w:val="single" w:color="A0A0A0" w:sz="4"/>
+              <w:left w:val="single" w:color="A0A0A0" w:sz="4"/>
+              <w:bottom w:val="single" w:color="A0A0A0" w:sz="4"/>
+              <w:right w:val="single" w:color="A0A0A0" w:sz="4"/>
+            </w:tcBorders>
+            <w:tcMar>
+              <w:top w:type="dxa" w:w="60"/>
+              <w:left w:type="dxa" w:w="90"/>
+              <w:bottom w:type="dxa" w:w="60"/>
+              <w:right w:type="dxa" w:w="90"/>
+            </w:tcMar>
+          </w:tcPr>
+          <w:p>
+            <w:r>
+              <w:rPr>
+                <w:rFonts w:ascii="Malgun Gothic" w:cs="Malgun Gothic" w:eastAsia="Malgun Gothic" w:hAnsi="Malgun Gothic"/>
+                <w:sz w:val="17"/>
+                <w:szCs w:val="17"/>
+              </w:rPr>
+              <w:t xml:space="preserve">M0</w:t>
+            </w:r>
+          </w:p>
+        </w:tc>
+        <w:tc>
+          <w:tcPr>
+            <w:tcW w:type="dxa" w:w="7517"/>
+            <w:tcBorders>
+              <w:top w:val="single" w:color="A0A0A0" w:sz="4"/>
+              <w:left w:val="single" w:color="A0A0A0" w:sz="4"/>
+              <w:bottom w:val="single" w:color="A0A0A0" w:sz="4"/>
+              <w:right w:val="single" w:color="A0A0A0" w:sz="4"/>
+            </w:tcBorders>
+            <w:tcMar>
+              <w:top w:type="dxa" w:w="60"/>
+              <w:left w:type="dxa" w:w="90"/>
+              <w:bottom w:type="dxa" w:w="60"/>
+              <w:right w:type="dxa" w:w="90"/>
+            </w:tcMar>
+          </w:tcPr>
+          <w:p>
+            <w:r>
+              <w:rPr>
+                <w:rFonts w:ascii="Malgun Gothic" w:cs="Malgun Gothic" w:eastAsia="Malgun Gothic" w:hAnsi="Malgun Gothic"/>
+                <w:sz w:val="17"/>
+                <w:szCs w:val="17"/>
+              </w:rPr>
+              <w:t xml:space="preserve">원격 전이 없음</w:t>
+            </w:r>
+          </w:p>
+        </w:tc>
+      </w:tr>
+      <w:tr>
+        <w:tc>
+          <w:tcPr>
+            <w:tcW w:type="dxa" w:w="964"/>
+            <w:tcBorders>
+              <w:top w:val="single" w:color="A0A0A0" w:sz="4"/>
+              <w:left w:val="single" w:color="A0A0A0" w:sz="4"/>
+              <w:bottom w:val="single" w:color="A0A0A0" w:sz="4"/>
+              <w:right w:val="single" w:color="A0A0A0" w:sz="4"/>
+            </w:tcBorders>
+            <w:shd w:fill="F2F6FA" w:color="auto" w:val="clear"/>
+            <w:tcMar>
+              <w:top w:type="dxa" w:w="60"/>
+              <w:left w:type="dxa" w:w="90"/>
+              <w:bottom w:type="dxa" w:w="60"/>
+              <w:right w:type="dxa" w:w="90"/>
+            </w:tcMar>
+          </w:tcPr>
+          <w:p/>
+        </w:tc>
+        <w:tc>
+          <w:tcPr>
+            <w:tcW w:type="dxa" w:w="1157"/>
+            <w:tcBorders>
+              <w:top w:val="single" w:color="A0A0A0" w:sz="4"/>
+              <w:left w:val="single" w:color="A0A0A0" w:sz="4"/>
+              <w:bottom w:val="single" w:color="A0A0A0" w:sz="4"/>
+              <w:right w:val="single" w:color="A0A0A0" w:sz="4"/>
+            </w:tcBorders>
+            <w:shd w:fill="F2F6FA" w:color="auto" w:val="clear"/>
+            <w:tcMar>
+              <w:top w:type="dxa" w:w="60"/>
+              <w:left w:type="dxa" w:w="90"/>
+              <w:bottom w:type="dxa" w:w="60"/>
+              <w:right w:type="dxa" w:w="90"/>
+            </w:tcMar>
+          </w:tcPr>
+          <w:p>
+            <w:r>
+              <w:rPr>
+                <w:rFonts w:ascii="Malgun Gothic" w:cs="Malgun Gothic" w:eastAsia="Malgun Gothic" w:hAnsi="Malgun Gothic"/>
+                <w:sz w:val="17"/>
+                <w:szCs w:val="17"/>
+              </w:rPr>
+              <w:t xml:space="preserve">M1</w:t>
+            </w:r>
+          </w:p>
+        </w:tc>
+        <w:tc>
+          <w:tcPr>
+            <w:tcW w:type="dxa" w:w="7517"/>
+            <w:tcBorders>
+              <w:top w:val="single" w:color="A0A0A0" w:sz="4"/>
+              <w:left w:val="single" w:color="A0A0A0" w:sz="4"/>
+              <w:bottom w:val="single" w:color="A0A0A0" w:sz="4"/>
+              <w:right w:val="single" w:color="A0A0A0" w:sz="4"/>
+            </w:tcBorders>
+            <w:shd w:fill="F2F6FA" w:color="auto" w:val="clear"/>
+            <w:tcMar>
+              <w:top w:type="dxa" w:w="60"/>
+              <w:left w:type="dxa" w:w="90"/>
+              <w:bottom w:type="dxa" w:w="60"/>
+              <w:right w:type="dxa" w:w="90"/>
+            </w:tcMar>
+          </w:tcPr>
+          <w:p>
+            <w:r>
+              <w:rPr>
+                <w:rFonts w:ascii="Malgun Gothic" w:cs="Malgun Gothic" w:eastAsia="Malgun Gothic" w:hAnsi="Malgun Gothic"/>
+                <w:sz w:val="17"/>
+                <w:szCs w:val="17"/>
+              </w:rPr>
+              <w:t xml:space="preserve">원격 전이 있음 (8판과 변화 없음)</w:t>
+            </w:r>
+          </w:p>
+        </w:tc>
+      </w:tr>
+      <w:tr>
+        <w:tc>
+          <w:tcPr>
+            <w:tcW w:type="dxa" w:w="964"/>
+            <w:tcBorders>
+              <w:top w:val="single" w:color="A0A0A0" w:sz="4"/>
+              <w:left w:val="single" w:color="A0A0A0" w:sz="4"/>
+              <w:bottom w:val="single" w:color="A0A0A0" w:sz="4"/>
+              <w:right w:val="single" w:color="A0A0A0" w:sz="4"/>
+            </w:tcBorders>
+            <w:tcMar>
+              <w:top w:type="dxa" w:w="60"/>
+              <w:left w:type="dxa" w:w="90"/>
+              <w:bottom w:type="dxa" w:w="60"/>
+              <w:right w:type="dxa" w:w="90"/>
+            </w:tcMar>
+          </w:tcPr>
+          <w:p>
+            <w:r>
+              <w:rPr>
+                <w:rFonts w:ascii="Malgun Gothic" w:cs="Malgun Gothic" w:eastAsia="Malgun Gothic" w:hAnsi="Malgun Gothic"/>
+                <w:sz w:val="17"/>
+                <w:szCs w:val="17"/>
+              </w:rPr>
+              <w:t xml:space="preserve">Stage</w:t>
+            </w:r>
+          </w:p>
+        </w:tc>
+        <w:tc>
+          <w:tcPr>
+            <w:tcW w:type="dxa" w:w="1157"/>
+            <w:tcBorders>
+              <w:top w:val="single" w:color="A0A0A0" w:sz="4"/>
+              <w:left w:val="single" w:color="A0A0A0" w:sz="4"/>
+              <w:bottom w:val="single" w:color="A0A0A0" w:sz="4"/>
+              <w:right w:val="single" w:color="A0A0A0" w:sz="4"/>
+            </w:tcBorders>
+            <w:tcMar>
+              <w:top w:type="dxa" w:w="60"/>
+              <w:left w:type="dxa" w:w="90"/>
+              <w:bottom w:type="dxa" w:w="60"/>
+              <w:right w:type="dxa" w:w="90"/>
+            </w:tcMar>
+          </w:tcPr>
+          <w:p>
+            <w:r>
+              <w:rPr>
+                <w:rFonts w:ascii="Malgun Gothic" w:cs="Malgun Gothic" w:eastAsia="Malgun Gothic" w:hAnsi="Malgun Gothic"/>
+                <w:sz w:val="17"/>
+                <w:szCs w:val="17"/>
+              </w:rPr>
+              <w:t xml:space="preserve">I</w:t>
+            </w:r>
+          </w:p>
+        </w:tc>
+        <w:tc>
+          <w:tcPr>
+            <w:tcW w:type="dxa" w:w="7517"/>
+            <w:tcBorders>
+              <w:top w:val="single" w:color="A0A0A0" w:sz="4"/>
+              <w:left w:val="single" w:color="A0A0A0" w:sz="4"/>
+              <w:bottom w:val="single" w:color="A0A0A0" w:sz="4"/>
+              <w:right w:val="single" w:color="A0A0A0" w:sz="4"/>
+            </w:tcBorders>
+            <w:tcMar>
+              <w:top w:type="dxa" w:w="60"/>
+              <w:left w:type="dxa" w:w="90"/>
+              <w:bottom w:type="dxa" w:w="60"/>
+              <w:right w:type="dxa" w:w="90"/>
+            </w:tcMar>
+          </w:tcPr>
+          <w:p>
+            <w:r>
+              <w:rPr>
+                <w:rFonts w:ascii="Malgun Gothic" w:cs="Malgun Gothic" w:eastAsia="Malgun Gothic" w:hAnsi="Malgun Gothic"/>
+                <w:sz w:val="17"/>
+                <w:szCs w:val="17"/>
+              </w:rPr>
+              <w:t xml:space="preserve">T1 N0 M0</w:t>
+            </w:r>
+          </w:p>
+        </w:tc>
+      </w:tr>
+      <w:tr>
+        <w:tc>
+          <w:tcPr>
+            <w:tcW w:type="dxa" w:w="964"/>
+            <w:tcBorders>
+              <w:top w:val="single" w:color="A0A0A0" w:sz="4"/>
+              <w:left w:val="single" w:color="A0A0A0" w:sz="4"/>
+              <w:bottom w:val="single" w:color="A0A0A0" w:sz="4"/>
+              <w:right w:val="single" w:color="A0A0A0" w:sz="4"/>
+            </w:tcBorders>
+            <w:shd w:fill="F2F6FA" w:color="auto" w:val="clear"/>
+            <w:tcMar>
+              <w:top w:type="dxa" w:w="60"/>
+              <w:left w:type="dxa" w:w="90"/>
+              <w:bottom w:type="dxa" w:w="60"/>
+              <w:right w:type="dxa" w:w="90"/>
+            </w:tcMar>
+          </w:tcPr>
+          <w:p/>
+        </w:tc>
+        <w:tc>
+          <w:tcPr>
+            <w:tcW w:type="dxa" w:w="1157"/>
+            <w:tcBorders>
+              <w:top w:val="single" w:color="A0A0A0" w:sz="4"/>
+              <w:left w:val="single" w:color="A0A0A0" w:sz="4"/>
+              <w:bottom w:val="single" w:color="A0A0A0" w:sz="4"/>
+              <w:right w:val="single" w:color="A0A0A0" w:sz="4"/>
+            </w:tcBorders>
+            <w:shd w:fill="F2F6FA" w:color="auto" w:val="clear"/>
+            <w:tcMar>
+              <w:top w:type="dxa" w:w="60"/>
+              <w:left w:type="dxa" w:w="90"/>
+              <w:bottom w:type="dxa" w:w="60"/>
+              <w:right w:type="dxa" w:w="90"/>
+            </w:tcMar>
+          </w:tcPr>
+          <w:p>
+            <w:r>
+              <w:rPr>
+                <w:rFonts w:ascii="Malgun Gothic" w:cs="Malgun Gothic" w:eastAsia="Malgun Gothic" w:hAnsi="Malgun Gothic"/>
+                <w:sz w:val="17"/>
+                <w:szCs w:val="17"/>
+              </w:rPr>
+              <w:t xml:space="preserve">II</w:t>
+            </w:r>
+          </w:p>
+        </w:tc>
+        <w:tc>
+          <w:tcPr>
+            <w:tcW w:type="dxa" w:w="7517"/>
+            <w:tcBorders>
+              <w:top w:val="single" w:color="A0A0A0" w:sz="4"/>
+              <w:left w:val="single" w:color="A0A0A0" w:sz="4"/>
+              <w:bottom w:val="single" w:color="A0A0A0" w:sz="4"/>
+              <w:right w:val="single" w:color="A0A0A0" w:sz="4"/>
+            </w:tcBorders>
+            <w:shd w:fill="F2F6FA" w:color="auto" w:val="clear"/>
+            <w:tcMar>
+              <w:top w:type="dxa" w:w="60"/>
+              <w:left w:type="dxa" w:w="90"/>
+              <w:bottom w:type="dxa" w:w="60"/>
+              <w:right w:type="dxa" w:w="90"/>
+            </w:tcMar>
+          </w:tcPr>
+          <w:p>
+            <w:r>
+              <w:rPr>
+                <w:rFonts w:ascii="Malgun Gothic" w:cs="Malgun Gothic" w:eastAsia="Malgun Gothic" w:hAnsi="Malgun Gothic"/>
+                <w:sz w:val="17"/>
+                <w:szCs w:val="17"/>
+              </w:rPr>
+              <w:t xml:space="preserve">T2 N0 M0</w:t>
+            </w:r>
+          </w:p>
+        </w:tc>
+      </w:tr>
+      <w:tr>
+        <w:tc>
+          <w:tcPr>
+            <w:tcW w:type="dxa" w:w="964"/>
+            <w:tcBorders>
+              <w:top w:val="single" w:color="A0A0A0" w:sz="4"/>
+              <w:left w:val="single" w:color="A0A0A0" w:sz="4"/>
+              <w:bottom w:val="single" w:color="A0A0A0" w:sz="4"/>
+              <w:right w:val="single" w:color="A0A0A0" w:sz="4"/>
+            </w:tcBorders>
+            <w:tcMar>
+              <w:top w:type="dxa" w:w="60"/>
+              <w:left w:type="dxa" w:w="90"/>
+              <w:bottom w:type="dxa" w:w="60"/>
+              <w:right w:type="dxa" w:w="90"/>
+            </w:tcMar>
+          </w:tcPr>
+          <w:p/>
+        </w:tc>
+        <w:tc>
+          <w:tcPr>
+            <w:tcW w:type="dxa" w:w="1157"/>
+            <w:tcBorders>
+              <w:top w:val="single" w:color="A0A0A0" w:sz="4"/>
+              <w:left w:val="single" w:color="A0A0A0" w:sz="4"/>
+              <w:bottom w:val="single" w:color="A0A0A0" w:sz="4"/>
+              <w:right w:val="single" w:color="A0A0A0" w:sz="4"/>
+            </w:tcBorders>
+            <w:tcMar>
+              <w:top w:type="dxa" w:w="60"/>
+              <w:left w:type="dxa" w:w="90"/>
+              <w:bottom w:type="dxa" w:w="60"/>
+              <w:right w:type="dxa" w:w="90"/>
+            </w:tcMar>
+          </w:tcPr>
+          <w:p>
+            <w:r>
+              <w:rPr>
+                <w:rFonts w:ascii="Malgun Gothic" w:cs="Malgun Gothic" w:eastAsia="Malgun Gothic" w:hAnsi="Malgun Gothic"/>
+                <w:sz w:val="17"/>
+                <w:szCs w:val="17"/>
+              </w:rPr>
+              <w:t xml:space="preserve">IIIA</w:t>
+            </w:r>
+          </w:p>
+        </w:tc>
+        <w:tc>
+          <w:tcPr>
+            <w:tcW w:type="dxa" w:w="7517"/>
+            <w:tcBorders>
+              <w:top w:val="single" w:color="A0A0A0" w:sz="4"/>
+              <w:left w:val="single" w:color="A0A0A0" w:sz="4"/>
+              <w:bottom w:val="single" w:color="A0A0A0" w:sz="4"/>
+              <w:right w:val="single" w:color="A0A0A0" w:sz="4"/>
+            </w:tcBorders>
+            <w:tcMar>
+              <w:top w:type="dxa" w:w="60"/>
+              <w:left w:type="dxa" w:w="90"/>
+              <w:bottom w:type="dxa" w:w="60"/>
+              <w:right w:type="dxa" w:w="90"/>
+            </w:tcMar>
+          </w:tcPr>
+          <w:p>
+            <w:r>
+              <w:rPr>
+                <w:rFonts w:ascii="Malgun Gothic" w:cs="Malgun Gothic" w:eastAsia="Malgun Gothic" w:hAnsi="Malgun Gothic"/>
+                <w:sz w:val="17"/>
+                <w:szCs w:val="17"/>
+              </w:rPr>
+              <w:t xml:space="preserve">T1–2 N1 M0 / T3–4 N0 M0</w:t>
+            </w:r>
+          </w:p>
+        </w:tc>
+      </w:tr>
+      <w:tr>
+        <w:tc>
+          <w:tcPr>
+            <w:tcW w:type="dxa" w:w="964"/>
+            <w:tcBorders>
+              <w:top w:val="single" w:color="A0A0A0" w:sz="4"/>
+              <w:left w:val="single" w:color="A0A0A0" w:sz="4"/>
+              <w:bottom w:val="single" w:color="A0A0A0" w:sz="4"/>
+              <w:right w:val="single" w:color="A0A0A0" w:sz="4"/>
+            </w:tcBorders>
+            <w:shd w:fill="F2F6FA" w:color="auto" w:val="clear"/>
+            <w:tcMar>
+              <w:top w:type="dxa" w:w="60"/>
+              <w:left w:type="dxa" w:w="90"/>
+              <w:bottom w:type="dxa" w:w="60"/>
+              <w:right w:type="dxa" w:w="90"/>
+            </w:tcMar>
+          </w:tcPr>
+          <w:p/>
+        </w:tc>
+        <w:tc>
+          <w:tcPr>
+            <w:tcW w:type="dxa" w:w="1157"/>
+            <w:tcBorders>
+              <w:top w:val="single" w:color="A0A0A0" w:sz="4"/>
+              <w:left w:val="single" w:color="A0A0A0" w:sz="4"/>
+              <w:bottom w:val="single" w:color="A0A0A0" w:sz="4"/>
+              <w:right w:val="single" w:color="A0A0A0" w:sz="4"/>
+            </w:tcBorders>
+            <w:shd w:fill="F2F6FA" w:color="auto" w:val="clear"/>
+            <w:tcMar>
+              <w:top w:type="dxa" w:w="60"/>
+              <w:left w:type="dxa" w:w="90"/>
+              <w:bottom w:type="dxa" w:w="60"/>
+              <w:right w:type="dxa" w:w="90"/>
+            </w:tcMar>
+          </w:tcPr>
+          <w:p>
+            <w:r>
+              <w:rPr>
+                <w:rFonts w:ascii="Malgun Gothic" w:cs="Malgun Gothic" w:eastAsia="Malgun Gothic" w:hAnsi="Malgun Gothic"/>
+                <w:sz w:val="17"/>
+                <w:szCs w:val="17"/>
+              </w:rPr>
+              <w:t xml:space="preserve">IIIB</w:t>
+            </w:r>
+          </w:p>
+        </w:tc>
+        <w:tc>
+          <w:tcPr>
+            <w:tcW w:type="dxa" w:w="7517"/>
+            <w:tcBorders>
+              <w:top w:val="single" w:color="A0A0A0" w:sz="4"/>
+              <w:left w:val="single" w:color="A0A0A0" w:sz="4"/>
+              <w:bottom w:val="single" w:color="A0A0A0" w:sz="4"/>
+              <w:right w:val="single" w:color="A0A0A0" w:sz="4"/>
+            </w:tcBorders>
+            <w:shd w:fill="F2F6FA" w:color="auto" w:val="clear"/>
+            <w:tcMar>
+              <w:top w:type="dxa" w:w="60"/>
+              <w:left w:type="dxa" w:w="90"/>
+              <w:bottom w:type="dxa" w:w="60"/>
+              <w:right w:type="dxa" w:w="90"/>
+            </w:tcMar>
+          </w:tcPr>
+          <w:p>
+            <w:r>
+              <w:rPr>
+                <w:rFonts w:ascii="Malgun Gothic" w:cs="Malgun Gothic" w:eastAsia="Malgun Gothic" w:hAnsi="Malgun Gothic"/>
+                <w:sz w:val="17"/>
+                <w:szCs w:val="17"/>
+              </w:rPr>
+              <w:t xml:space="preserve">T3–4 N1 M0 / Any T N2 M0</w:t>
+            </w:r>
+          </w:p>
+        </w:tc>
+      </w:tr>
+      <w:tr>
+        <w:tc>
+          <w:tcPr>
+            <w:tcW w:type="dxa" w:w="964"/>
+            <w:tcBorders>
+              <w:top w:val="single" w:color="A0A0A0" w:sz="4"/>
+              <w:left w:val="single" w:color="A0A0A0" w:sz="4"/>
+              <w:bottom w:val="single" w:color="A0A0A0" w:sz="4"/>
+              <w:right w:val="single" w:color="A0A0A0" w:sz="4"/>
+            </w:tcBorders>
+            <w:tcMar>
+              <w:top w:type="dxa" w:w="60"/>
+              <w:left w:type="dxa" w:w="90"/>
+              <w:bottom w:type="dxa" w:w="60"/>
+              <w:right w:type="dxa" w:w="90"/>
+            </w:tcMar>
+          </w:tcPr>
+          <w:p/>
+        </w:tc>
+        <w:tc>
+          <w:tcPr>
+            <w:tcW w:type="dxa" w:w="1157"/>
+            <w:tcBorders>
+              <w:top w:val="single" w:color="A0A0A0" w:sz="4"/>
+              <w:left w:val="single" w:color="A0A0A0" w:sz="4"/>
+              <w:bottom w:val="single" w:color="A0A0A0" w:sz="4"/>
+              <w:right w:val="single" w:color="A0A0A0" w:sz="4"/>
+            </w:tcBorders>
+            <w:tcMar>
+              <w:top w:type="dxa" w:w="60"/>
+              <w:left w:type="dxa" w:w="90"/>
+              <w:bottom w:type="dxa" w:w="60"/>
+              <w:right w:type="dxa" w:w="90"/>
+            </w:tcMar>
+          </w:tcPr>
+          <w:p>
+            <w:r>
+              <w:rPr>
+                <w:rFonts w:ascii="Malgun Gothic" w:cs="Malgun Gothic" w:eastAsia="Malgun Gothic" w:hAnsi="Malgun Gothic"/>
+                <w:sz w:val="17"/>
+                <w:szCs w:val="17"/>
+              </w:rPr>
+              <w:t xml:space="preserve">IV</w:t>
+            </w:r>
+          </w:p>
+        </w:tc>
+        <w:tc>
+          <w:tcPr>
+            <w:tcW w:type="dxa" w:w="7517"/>
+            <w:tcBorders>
+              <w:top w:val="single" w:color="A0A0A0" w:sz="4"/>
+              <w:left w:val="single" w:color="A0A0A0" w:sz="4"/>
+              <w:bottom w:val="single" w:color="A0A0A0" w:sz="4"/>
+              <w:right w:val="single" w:color="A0A0A0" w:sz="4"/>
+            </w:tcBorders>
+            <w:tcMar>
+              <w:top w:type="dxa" w:w="60"/>
+              <w:left w:type="dxa" w:w="90"/>
+              <w:bottom w:type="dxa" w:w="60"/>
+              <w:right w:type="dxa" w:w="90"/>
+            </w:tcMar>
+          </w:tcPr>
+          <w:p>
+            <w:r>
+              <w:rPr>
+                <w:rFonts w:ascii="Malgun Gothic" w:cs="Malgun Gothic" w:eastAsia="Malgun Gothic" w:hAnsi="Malgun Gothic"/>
+                <w:sz w:val="17"/>
+                <w:szCs w:val="17"/>
+              </w:rPr>
+              <w:t xml:space="preserve">Any T Any N </w:t>
+            </w:r>
+            <w:r>
+              <w:rPr>
+                <w:rFonts w:ascii="Malgun Gothic" w:cs="Malgun Gothic" w:eastAsia="Malgun Gothic" w:hAnsi="Malgun Gothic"/>
+                <w:sz w:val="17"/>
+                <w:szCs w:val="17"/>
+              </w:rPr>
+              <w:t xml:space="preserve">M1</w:t>
+            </w:r>
+            <w:r>
+              <w:rPr>
+                <w:rFonts w:ascii="Malgun Gothic" w:cs="Malgun Gothic" w:eastAsia="Malgun Gothic" w:hAnsi="Malgun Gothic"/>
+                <w:sz w:val="17"/>
+                <w:szCs w:val="17"/>
+              </w:rPr>
+              <w:t xml:space="preserve"> (M0는 stage I–III에 한정)</w:t>
             </w:r>
           </w:p>
         </w:tc>
@@ -8654,7 +9775,7 @@
           <w:sz w:val="17"/>
           <w:szCs w:val="17"/>
         </w:rPr>
-        <w:t xml:space="preserve">EPE = 임상적/육안적 연부조직 침범 (현미경적 침범만으로는 EPE 아님). Minor salivary gland 암은 발생 부위(구강, 부비동, 인두 등) 병기체계를 따름. 출처: [16]</w:t>
+        <w:t xml:space="preserve">T 기준 자체는 8판과 동일하고 T3/T4 문구만 명확화됨. T4a/T4b 구조물 예시는 8판 기준이며, V9 원문 목록은 AJCC protocol 원본 확인 권장. 출처: [18] (8판: [16])</w:t>
       </w:r>
     </w:p>
     <w:p>
@@ -10995,7 +12116,7 @@
         </w:rPr>
         <w:t xml:space="preserve"> doi: </w:t>
       </w:r>
-      <w:hyperlink w:history="1" r:id="rIdhp72jjkxymy2dku_idfh7">
+      <w:hyperlink w:history="1" r:id="rIduuwz3xcp9tfaml94akdst">
         <w:r>
           <w:rPr>
             <w:rStyle w:val="Hyperlink"/>
@@ -11027,7 +12148,7 @@
         </w:rPr>
         <w:t xml:space="preserve"> doi: </w:t>
       </w:r>
-      <w:hyperlink w:history="1" r:id="rIdxeylfkycflnytppnvhbqp">
+      <w:hyperlink w:history="1" r:id="rId0pgmonby_d10vmvetlsd0">
         <w:r>
           <w:rPr>
             <w:rStyle w:val="Hyperlink"/>
@@ -11059,7 +12180,7 @@
         </w:rPr>
         <w:t xml:space="preserve"> doi: </w:t>
       </w:r>
-      <w:hyperlink w:history="1" r:id="rIdubzgs9e0zovzodcg_skut">
+      <w:hyperlink w:history="1" r:id="rIdjhvhnsvar0wwyg7gyxr4v">
         <w:r>
           <w:rPr>
             <w:rStyle w:val="Hyperlink"/>
@@ -11091,7 +12212,7 @@
         </w:rPr>
         <w:t xml:space="preserve"> doi: </w:t>
       </w:r>
-      <w:hyperlink w:history="1" r:id="rIderyzyiym8kb6wrs65-id1">
+      <w:hyperlink w:history="1" r:id="rIddq00cf-mus1z51hjbbhtz">
         <w:r>
           <w:rPr>
             <w:rStyle w:val="Hyperlink"/>
@@ -11136,7 +12257,7 @@
         </w:rPr>
         <w:t xml:space="preserve"> doi: </w:t>
       </w:r>
-      <w:hyperlink w:history="1" r:id="rIddiouzbi6solnhcbmnyyll">
+      <w:hyperlink w:history="1" r:id="rId_icapupde79cwshrjmszq">
         <w:r>
           <w:rPr>
             <w:rStyle w:val="Hyperlink"/>
@@ -11168,7 +12289,7 @@
         </w:rPr>
         <w:t xml:space="preserve"> doi: </w:t>
       </w:r>
-      <w:hyperlink w:history="1" r:id="rId_cikelzur6i8smoifgoro">
+      <w:hyperlink w:history="1" r:id="rIds7uohjusskpikx4qzc3lt">
         <w:r>
           <w:rPr>
             <w:rStyle w:val="Hyperlink"/>
@@ -11200,7 +12321,7 @@
         </w:rPr>
         <w:t xml:space="preserve"> doi: </w:t>
       </w:r>
-      <w:hyperlink w:history="1" r:id="rId8wkbfernyuhcehnfsv3aa">
+      <w:hyperlink w:history="1" r:id="rIdxzcz5-ntbg_l0xur8ms5u">
         <w:r>
           <w:rPr>
             <w:rStyle w:val="Hyperlink"/>
@@ -11232,7 +12353,7 @@
         </w:rPr>
         <w:t xml:space="preserve"> doi: </w:t>
       </w:r>
-      <w:hyperlink w:history="1" r:id="rIdrbwek76gxwo49m9ymaqn5">
+      <w:hyperlink w:history="1" r:id="rIdlapjrdcwwpptku_2wtrz-">
         <w:r>
           <w:rPr>
             <w:rStyle w:val="Hyperlink"/>
@@ -11264,7 +12385,7 @@
         </w:rPr>
         <w:t xml:space="preserve"> doi: </w:t>
       </w:r>
-      <w:hyperlink w:history="1" r:id="rIdqb_iucvo0anal5xu3juf3">
+      <w:hyperlink w:history="1" r:id="rId3nabfchrg0alywgne1xkj">
         <w:r>
           <w:rPr>
             <w:rStyle w:val="Hyperlink"/>
@@ -11296,7 +12417,7 @@
         </w:rPr>
         <w:t xml:space="preserve"> doi: </w:t>
       </w:r>
-      <w:hyperlink w:history="1" r:id="rIdrtzygm_ngsfjlp_cikq_v">
+      <w:hyperlink w:history="1" r:id="rId7kzesz4y2yufzfw_xwz6c">
         <w:r>
           <w:rPr>
             <w:rStyle w:val="Hyperlink"/>
@@ -11328,7 +12449,7 @@
         </w:rPr>
         <w:t xml:space="preserve"> doi: </w:t>
       </w:r>
-      <w:hyperlink w:history="1" r:id="rIdjtshnvn5ovx-io_2fsbgj">
+      <w:hyperlink w:history="1" r:id="rIdgedun-iic846208vyltgr">
         <w:r>
           <w:rPr>
             <w:rStyle w:val="Hyperlink"/>
@@ -11360,7 +12481,7 @@
         </w:rPr>
         <w:t xml:space="preserve"> doi: </w:t>
       </w:r>
-      <w:hyperlink w:history="1" r:id="rIdqomt-kpzpp5cuhmhabqbs">
+      <w:hyperlink w:history="1" r:id="rIdaa7fwmahfxnbgvkayjm6h">
         <w:r>
           <w:rPr>
             <w:rStyle w:val="Hyperlink"/>
@@ -11392,7 +12513,7 @@
         </w:rPr>
         <w:t xml:space="preserve"> doi: </w:t>
       </w:r>
-      <w:hyperlink w:history="1" r:id="rIdbc1wvl0so_uizcasuwkfq">
+      <w:hyperlink w:history="1" r:id="rId3swisxgpcayzqik-fuawh">
         <w:r>
           <w:rPr>
             <w:rStyle w:val="Hyperlink"/>
@@ -11414,7 +12535,7 @@
           <w:sz w:val="18"/>
           <w:szCs w:val="18"/>
         </w:rPr>
-        <w:t xml:space="preserve">[16] Amin MB, et al., eds. AJCC Cancer Staging Manual, 8th ed. Springer; 2017 — Major Salivary Glands chapter.</w:t>
+        <w:t xml:space="preserve">[16] Amin MB, et al., eds. AJCC Cancer Staging Manual, 8th ed. Springer; 2017 — Major Salivary Glands chapter. (2026-01-01부터 V9로 대체)</w:t>
       </w:r>
     </w:p>
     <w:p>
@@ -11429,6 +12550,38 @@
         </w:rPr>
         <w:t xml:space="preserve">[17] 표준 교과서: Koch BL, Hamilton BE, Hudgins PA, Harnsberger HR. Diagnostic Imaging: Head and Neck, 3rd ed. Elsevier; 2016 / Som PM, Curtin HD. Head and Neck Imaging, 5th ed. Mosby; 2011. (일반적 임상·영상 지식의 근거; 개별 수치는 원문 확인 권장)</w:t>
       </w:r>
+    </w:p>
+    <w:p>
+      <w:pPr>
+        <w:spacing w:after="80"/>
+      </w:pPr>
+      <w:r>
+        <w:rPr>
+          <w:rFonts w:ascii="Malgun Gothic" w:cs="Malgun Gothic" w:eastAsia="Malgun Gothic" w:hAnsi="Malgun Gothic"/>
+          <w:sz w:val="18"/>
+          <w:szCs w:val="18"/>
+        </w:rPr>
+        <w:t xml:space="preserve">[18] Huang SH, Seethala RR, Patel SG, et al. Key Updates on the Version 9 AJCC/UICC Staging System for Salivary Gland Carcinoma. Ann Surg Oncol. 2026;33(6):4958-4963.</w:t>
+      </w:r>
+      <w:r>
+        <w:rPr>
+          <w:rFonts w:ascii="Malgun Gothic" w:cs="Malgun Gothic" w:eastAsia="Malgun Gothic" w:hAnsi="Malgun Gothic"/>
+          <w:sz w:val="18"/>
+          <w:szCs w:val="18"/>
+        </w:rPr>
+        <w:t xml:space="preserve"> doi: </w:t>
+      </w:r>
+      <w:hyperlink w:history="1" r:id="rIdh51o5z7xyospij4l_j7fo">
+        <w:r>
+          <w:rPr>
+            <w:rStyle w:val="Hyperlink"/>
+            <w:rFonts w:ascii="Malgun Gothic" w:cs="Malgun Gothic" w:eastAsia="Malgun Gothic" w:hAnsi="Malgun Gothic"/>
+            <w:sz w:val="18"/>
+            <w:szCs w:val="18"/>
+          </w:rPr>
+          <w:t xml:space="preserve">10.1245/s10434-026-19350-5</w:t>
+        </w:r>
+      </w:hyperlink>
     </w:p>
     <w:p>
       <w:pPr>
@@ -11443,7 +12596,7 @@
           <w:sz w:val="17"/>
           <w:szCs w:val="17"/>
         </w:rPr>
-        <w:t xml:space="preserve">[2]–[15]의 서지 정보는 PubMed에서 확인함.</w:t>
+        <w:t xml:space="preserve">[2]–[15], [18]의 서지 정보는 PubMed에서 확인함.</w:t>
       </w:r>
     </w:p>
     <w:sectPr>

</xml_diff>